<commit_message>
Add Netlify hosting config; record hosting decisions in PM report
Proxies /api/* to the Render backend so the session cookie stays first-party,
serves index.html for client-side routes, and sets security and cache headers.

Co-Authored-By: Claude Opus 5.5 <noreply@anthropic.com>
</commit_message>
<xml_diff>
--- a/docs/pm/Therapist-Portal-Feature-Report.docx
+++ b/docs/pm/Therapist-Portal-Feature-Report.docx
@@ -914,7 +914,7 @@
                 <w:sz w:val="20"/>
                 <w:szCs w:val="20"/>
               </w:rPr>
-              <w:t xml:space="preserve">Built and tested — ready to deploy</w:t>
+              <w:t xml:space="preserve">Built and tested — hosting set up, accounts to be created</w:t>
             </w:r>
           </w:p>
         </w:tc>
@@ -7040,7 +7040,7 @@
         <w:rPr>
           <w:rFonts w:ascii="Arial" w:cs="Arial" w:eastAsia="Arial" w:hAnsi="Arial"/>
         </w:rPr>
-        <w:t xml:space="preserve">Built and tested — ready to deploy</w:t>
+        <w:t xml:space="preserve">Built and tested — hosting set up, accounts to be created</w:t>
       </w:r>
     </w:p>
     <w:p>
@@ -7253,13 +7253,36 @@
           <w:b/>
           <w:bCs/>
         </w:rPr>
+        <w:t xml:space="preserve">Hosting chosen and configured (free tiers). </w:t>
+      </w:r>
+      <w:r>
+        <w:rPr>
+          <w:rFonts w:ascii="Arial" w:cs="Arial" w:eastAsia="Arial" w:hAnsi="Arial"/>
+        </w:rPr>
+        <w:t xml:space="preserve">Website on Netlify, server on Render, database on Neon — all in Singapore, closest to India. The website forwards ksiracare.com/api to the server, so sign-in works in every browser including Safari. The project files for all three are ready; what remains is creating the accounts and pasting in the settings.</w:t>
+      </w:r>
+    </w:p>
+    <w:p>
+      <w:pPr>
+        <w:pStyle w:val="ListParagraph"/>
+        <w:numPr>
+          <w:ilvl w:val="0"/>
+          <w:numId w:val="2"/>
+        </w:numPr>
+      </w:pPr>
+      <w:r>
+        <w:rPr>
+          <w:rFonts w:ascii="Arial" w:cs="Arial" w:eastAsia="Arial" w:hAnsi="Arial"/>
+          <w:b/>
+          <w:bCs/>
+        </w:rPr>
         <w:t xml:space="preserve">Tested end to end. </w:t>
       </w:r>
       <w:r>
         <w:rPr>
           <w:rFonts w:ascii="Arial" w:cs="Arial" w:eastAsia="Arial" w:hAnsi="Arial"/>
         </w:rPr>
-        <w:t xml:space="preserve">40 automated checks on the server, plus the full portal clicked through against the real backend: sign-in, dashboard, marking sessions, saving hours and the profile.</w:t>
+        <w:t xml:space="preserve">53 automated checks on the server, plus the full portal clicked through against the real backend: sign-in, dashboard, marking sessions, saving hours and the profile.</w:t>
       </w:r>
     </w:p>
     <w:p>
@@ -7517,6 +7540,132 @@
                 <w:szCs w:val="20"/>
               </w:rPr>
               <w:t xml:space="preserve">Neither is shown (country was dropped; payouts are out of scope), and not sending data that isn’t needed protects client privacy. Both stay in the database.</w:t>
+            </w:r>
+          </w:p>
+        </w:tc>
+      </w:tr>
+      <w:tr>
+        <w:trPr>
+          <w:cantSplit/>
+        </w:trPr>
+        <w:tc>
+          <w:tcPr>
+            <w:tcW w:type="dxa" w:w="4026"/>
+            <w:tcBorders>
+              <w:top w:val="single" w:color="D9D9D9" w:sz="4"/>
+              <w:left w:val="single" w:color="D9D9D9" w:sz="4"/>
+              <w:bottom w:val="single" w:color="D9D9D9" w:sz="4"/>
+              <w:right w:val="single" w:color="D9D9D9" w:sz="4"/>
+            </w:tcBorders>
+            <w:tcMar>
+              <w:top w:type="dxa" w:w="80"/>
+              <w:left w:type="dxa" w:w="120"/>
+              <w:bottom w:type="dxa" w:w="80"/>
+              <w:right w:type="dxa" w:w="120"/>
+            </w:tcMar>
+          </w:tcPr>
+          <w:p>
+            <w:r>
+              <w:rPr>
+                <w:rFonts w:ascii="Arial" w:cs="Arial" w:eastAsia="Arial" w:hAnsi="Arial"/>
+                <w:b w:val="false"/>
+                <w:bCs w:val="false"/>
+                <w:sz w:val="20"/>
+                <w:szCs w:val="20"/>
+              </w:rPr>
+              <w:t xml:space="preserve">Netlify instead of Vercel for the website</w:t>
+            </w:r>
+          </w:p>
+        </w:tc>
+        <w:tc>
+          <w:tcPr>
+            <w:tcW w:type="dxa" w:w="5000"/>
+            <w:tcBorders>
+              <w:top w:val="single" w:color="D9D9D9" w:sz="4"/>
+              <w:left w:val="single" w:color="D9D9D9" w:sz="4"/>
+              <w:bottom w:val="single" w:color="D9D9D9" w:sz="4"/>
+              <w:right w:val="single" w:color="D9D9D9" w:sz="4"/>
+            </w:tcBorders>
+            <w:tcMar>
+              <w:top w:type="dxa" w:w="80"/>
+              <w:left w:type="dxa" w:w="120"/>
+              <w:bottom w:type="dxa" w:w="80"/>
+              <w:right w:type="dxa" w:w="120"/>
+            </w:tcMar>
+          </w:tcPr>
+          <w:p>
+            <w:r>
+              <w:rPr>
+                <w:rFonts w:ascii="Arial" w:cs="Arial" w:eastAsia="Arial" w:hAnsi="Arial"/>
+                <w:b w:val="false"/>
+                <w:bCs w:val="false"/>
+                <w:sz w:val="20"/>
+                <w:szCs w:val="20"/>
+              </w:rPr>
+              <w:t xml:space="preserve">Vercel’s free plan doesn’t allow commercial sites, and Ksira Care takes paid bookings. Netlify’s free plan does, and works the same way.</w:t>
+            </w:r>
+          </w:p>
+        </w:tc>
+      </w:tr>
+      <w:tr>
+        <w:trPr>
+          <w:cantSplit/>
+        </w:trPr>
+        <w:tc>
+          <w:tcPr>
+            <w:tcW w:type="dxa" w:w="4026"/>
+            <w:tcBorders>
+              <w:top w:val="single" w:color="D9D9D9" w:sz="4"/>
+              <w:left w:val="single" w:color="D9D9D9" w:sz="4"/>
+              <w:bottom w:val="single" w:color="D9D9D9" w:sz="4"/>
+              <w:right w:val="single" w:color="D9D9D9" w:sz="4"/>
+            </w:tcBorders>
+            <w:tcMar>
+              <w:top w:type="dxa" w:w="80"/>
+              <w:left w:type="dxa" w:w="120"/>
+              <w:bottom w:type="dxa" w:w="80"/>
+              <w:right w:type="dxa" w:w="120"/>
+            </w:tcMar>
+          </w:tcPr>
+          <w:p>
+            <w:r>
+              <w:rPr>
+                <w:rFonts w:ascii="Arial" w:cs="Arial" w:eastAsia="Arial" w:hAnsi="Arial"/>
+                <w:b w:val="false"/>
+                <w:bCs w:val="false"/>
+                <w:sz w:val="20"/>
+                <w:szCs w:val="20"/>
+              </w:rPr>
+              <w:t xml:space="preserve">Free hosting tiers to start</w:t>
+            </w:r>
+          </w:p>
+        </w:tc>
+        <w:tc>
+          <w:tcPr>
+            <w:tcW w:type="dxa" w:w="5000"/>
+            <w:tcBorders>
+              <w:top w:val="single" w:color="D9D9D9" w:sz="4"/>
+              <w:left w:val="single" w:color="D9D9D9" w:sz="4"/>
+              <w:bottom w:val="single" w:color="D9D9D9" w:sz="4"/>
+              <w:right w:val="single" w:color="D9D9D9" w:sz="4"/>
+            </w:tcBorders>
+            <w:tcMar>
+              <w:top w:type="dxa" w:w="80"/>
+              <w:left w:type="dxa" w:w="120"/>
+              <w:bottom w:type="dxa" w:w="80"/>
+              <w:right w:type="dxa" w:w="120"/>
+            </w:tcMar>
+          </w:tcPr>
+          <w:p>
+            <w:r>
+              <w:rPr>
+                <w:rFonts w:ascii="Arial" w:cs="Arial" w:eastAsia="Arial" w:hAnsi="Arial"/>
+                <w:b w:val="false"/>
+                <w:bCs w:val="false"/>
+                <w:sz w:val="20"/>
+                <w:szCs w:val="20"/>
+              </w:rPr>
+              <w:t xml:space="preserve">No cost while usage is low. Trade-off: after about 15 minutes with no visitors the server sleeps, and the next sign-in can take up to a minute. A paid Render plan (about $7/month) removes this.</w:t>
             </w:r>
           </w:p>
         </w:tc>
@@ -7737,7 +7886,7 @@
                 <w:sz w:val="20"/>
                 <w:szCs w:val="20"/>
               </w:rPr>
-              <w:t xml:space="preserve">Host the API at ksiracare.com/api behind the website (same domain)</w:t>
+              <w:t xml:space="preserve">Create the Neon, Render and Netlify accounts and enter the production settings (database details and a newly generated signing key)</w:t>
             </w:r>
           </w:p>
         </w:tc>
@@ -7795,7 +7944,7 @@
                 <w:sz w:val="20"/>
                 <w:szCs w:val="20"/>
               </w:rPr>
-              <w:t xml:space="preserve">Blocker for launch: on a different domain (e.g. ksira-care.com), Safari blocks the sign-in cookie.</w:t>
+              <w:t xml:space="preserve">Blocker for launch. Step-by-step instructions are in the backend README; the server won’t start without the settings — by design.</w:t>
             </w:r>
           </w:p>
         </w:tc>
@@ -7829,7 +7978,7 @@
                 <w:sz w:val="20"/>
                 <w:szCs w:val="20"/>
               </w:rPr>
-              <w:t xml:space="preserve">Provision PostgreSQL and set the production settings, including a newly generated signing key</w:t>
+              <w:t xml:space="preserve">Point ksiracare.com at Netlify</w:t>
             </w:r>
           </w:p>
         </w:tc>
@@ -7887,7 +8036,7 @@
                 <w:sz w:val="20"/>
                 <w:szCs w:val="20"/>
               </w:rPr>
-              <w:t xml:space="preserve">The server won’t start in production without them — by design.</w:t>
+              <w:t xml:space="preserve">Blocker for launch: sign-in only works when the site and server share the ksiracare.com address.</w:t>
             </w:r>
           </w:p>
         </w:tc>
@@ -7921,7 +8070,7 @@
                 <w:sz w:val="20"/>
                 <w:szCs w:val="20"/>
               </w:rPr>
-              <w:t xml:space="preserve">Give admins a safe way to add therapists (passwords must be stored hashed, never as plain text)</w:t>
+              <w:t xml:space="preserve">Add the first real therapists</w:t>
             </w:r>
           </w:p>
         </w:tc>
@@ -7950,7 +8099,7 @@
                 <w:sz w:val="20"/>
                 <w:szCs w:val="20"/>
               </w:rPr>
-              <w:t xml:space="preserve">Backend / Ops</w:t>
+              <w:t xml:space="preserve">Ops</w:t>
             </w:r>
           </w:p>
         </w:tc>
@@ -7979,7 +8128,7 @@
                 <w:sz w:val="20"/>
                 <w:szCs w:val="20"/>
               </w:rPr>
-              <w:t xml:space="preserve">Admins add therapists directly to the database today; a small admin script or tool avoids mistakes.</w:t>
+              <w:t xml:space="preserve">The live database starts empty. Admins add therapists with a ready-made database command that stores passwords safely (hashed); a friendlier admin tool can come later.</w:t>
             </w:r>
           </w:p>
         </w:tc>
@@ -9403,6 +9552,69 @@
                 <w:szCs w:val="20"/>
               </w:rPr>
               <w:t xml:space="preserve">F6 Backend aligned with the portal and tested end to end: secure cookie sessions, data scoped to the signed-in therapist, sign-in protections, rules enforced on the server, IST throughout. All features now connected to the backend; hosting and database setup remain.</w:t>
+            </w:r>
+          </w:p>
+        </w:tc>
+      </w:tr>
+      <w:tr>
+        <w:trPr>
+          <w:cantSplit/>
+        </w:trPr>
+        <w:tc>
+          <w:tcPr>
+            <w:tcW w:type="dxa" w:w="2000"/>
+            <w:tcBorders>
+              <w:top w:val="single" w:color="D9D9D9" w:sz="4"/>
+              <w:left w:val="single" w:color="D9D9D9" w:sz="4"/>
+              <w:bottom w:val="single" w:color="D9D9D9" w:sz="4"/>
+              <w:right w:val="single" w:color="D9D9D9" w:sz="4"/>
+            </w:tcBorders>
+            <w:tcMar>
+              <w:top w:type="dxa" w:w="80"/>
+              <w:left w:type="dxa" w:w="120"/>
+              <w:bottom w:type="dxa" w:w="80"/>
+              <w:right w:type="dxa" w:w="120"/>
+            </w:tcMar>
+          </w:tcPr>
+          <w:p>
+            <w:r>
+              <w:rPr>
+                <w:rFonts w:ascii="Arial" w:cs="Arial" w:eastAsia="Arial" w:hAnsi="Arial"/>
+                <w:b w:val="false"/>
+                <w:bCs w:val="false"/>
+                <w:sz w:val="20"/>
+                <w:szCs w:val="20"/>
+              </w:rPr>
+              <w:t xml:space="preserve">3 October 2026</w:t>
+            </w:r>
+          </w:p>
+        </w:tc>
+        <w:tc>
+          <w:tcPr>
+            <w:tcW w:type="dxa" w:w="7026"/>
+            <w:tcBorders>
+              <w:top w:val="single" w:color="D9D9D9" w:sz="4"/>
+              <w:left w:val="single" w:color="D9D9D9" w:sz="4"/>
+              <w:bottom w:val="single" w:color="D9D9D9" w:sz="4"/>
+              <w:right w:val="single" w:color="D9D9D9" w:sz="4"/>
+            </w:tcBorders>
+            <w:tcMar>
+              <w:top w:type="dxa" w:w="80"/>
+              <w:left w:type="dxa" w:w="120"/>
+              <w:bottom w:type="dxa" w:w="80"/>
+              <w:right w:type="dxa" w:w="120"/>
+            </w:tcMar>
+          </w:tcPr>
+          <w:p>
+            <w:r>
+              <w:rPr>
+                <w:rFonts w:ascii="Arial" w:cs="Arial" w:eastAsia="Arial" w:hAnsi="Arial"/>
+                <w:b w:val="false"/>
+                <w:bCs w:val="false"/>
+                <w:sz w:val="20"/>
+                <w:szCs w:val="20"/>
+              </w:rPr>
+              <w:t xml:space="preserve">F6 Hosting: Netlify (website) + Render (server) + Neon (database), free tiers, Singapore. Vercel dropped — its free plan bars commercial use. Health check added for the host; instructions for adding therapists written. Remaining: create the accounts and point the domain.</w:t>
             </w:r>
           </w:p>
         </w:tc>

</xml_diff>

<commit_message>
Move hosting from Netlify to Render; document the deploy setup
The site now runs as a Render static site. Removes netlify.toml and records
the Render build settings, /api rewrite and DNS in the README. PM report
updated: site live at ksiracare.com.

Co-Authored-By: Claude Opus 5.5 <noreply@anthropic.com>
</commit_message>
<xml_diff>
--- a/docs/pm/Therapist-Portal-Feature-Report.docx
+++ b/docs/pm/Therapist-Portal-Feature-Report.docx
@@ -914,7 +914,7 @@
                 <w:sz w:val="20"/>
                 <w:szCs w:val="20"/>
               </w:rPr>
-              <w:t xml:space="preserve">Built and tested — hosting set up, accounts to be created</w:t>
+              <w:t xml:space="preserve">Live at ksiracare.com — first therapists to be added</w:t>
             </w:r>
           </w:p>
         </w:tc>
@@ -7040,7 +7040,7 @@
         <w:rPr>
           <w:rFonts w:ascii="Arial" w:cs="Arial" w:eastAsia="Arial" w:hAnsi="Arial"/>
         </w:rPr>
-        <w:t xml:space="preserve">Built and tested — hosting set up, accounts to be created</w:t>
+        <w:t xml:space="preserve">Live at ksiracare.com — first therapists to be added</w:t>
       </w:r>
     </w:p>
     <w:p>
@@ -7253,13 +7253,13 @@
           <w:b/>
           <w:bCs/>
         </w:rPr>
-        <w:t xml:space="preserve">Hosting chosen and configured (free tiers). </w:t>
-      </w:r>
-      <w:r>
-        <w:rPr>
-          <w:rFonts w:ascii="Arial" w:cs="Arial" w:eastAsia="Arial" w:hAnsi="Arial"/>
-        </w:rPr>
-        <w:t xml:space="preserve">Website on Netlify, server on Render, database on Neon — all in Singapore, closest to India. The website forwards ksiracare.com/api to the server, so sign-in works in every browser including Safari. The project files for all three are ready; what remains is creating the accounts and pasting in the settings.</w:t>
+        <w:t xml:space="preserve">Hosting set up and live (free tiers). </w:t>
+      </w:r>
+      <w:r>
+        <w:rPr>
+          <w:rFonts w:ascii="Arial" w:cs="Arial" w:eastAsia="Arial" w:hAnsi="Arial"/>
+        </w:rPr>
+        <w:t xml:space="preserve">Website and server on Render, database on Neon — all in Singapore, closest to India. The website forwards ksiracare.com/api to the server, so sign-in works in every browser including Safari. ksiracare.com now points to Render, with HTTPS.</w:t>
       </w:r>
     </w:p>
     <w:p>
@@ -7573,7 +7573,7 @@
                 <w:sz w:val="20"/>
                 <w:szCs w:val="20"/>
               </w:rPr>
-              <w:t xml:space="preserve">Netlify instead of Vercel for the website</w:t>
+              <w:t xml:space="preserve">Website on Render, not Vercel or Netlify</w:t>
             </w:r>
           </w:p>
         </w:tc>
@@ -7602,7 +7602,7 @@
                 <w:sz w:val="20"/>
                 <w:szCs w:val="20"/>
               </w:rPr>
-              <w:t xml:space="preserve">Vercel’s free plan doesn’t allow commercial sites, and Ksira Care takes paid bookings. Netlify’s free plan does, and works the same way.</w:t>
+              <w:t xml:space="preserve">Vercel’s free plan doesn’t allow commercial sites, and Ksira Care takes paid bookings. Netlify suspended the new account during setup without giving a reason. Render already hosts the server, allows commercial use for free, and keeps everything on one platform.</w:t>
             </w:r>
           </w:p>
         </w:tc>
@@ -7886,7 +7886,7 @@
                 <w:sz w:val="20"/>
                 <w:szCs w:val="20"/>
               </w:rPr>
-              <w:t xml:space="preserve">Create the Neon, Render and Netlify accounts and enter the production settings (database details and a newly generated signing key)</w:t>
+              <w:t xml:space="preserve">Add the first real therapists</w:t>
             </w:r>
           </w:p>
         </w:tc>
@@ -7915,7 +7915,7 @@
                 <w:sz w:val="20"/>
                 <w:szCs w:val="20"/>
               </w:rPr>
-              <w:t xml:space="preserve">DevOps</w:t>
+              <w:t xml:space="preserve">Ops</w:t>
             </w:r>
           </w:p>
         </w:tc>
@@ -7944,191 +7944,7 @@
                 <w:sz w:val="20"/>
                 <w:szCs w:val="20"/>
               </w:rPr>
-              <w:t xml:space="preserve">Blocker for launch. Step-by-step instructions are in the backend README; the server won’t start without the settings — by design.</w:t>
-            </w:r>
-          </w:p>
-        </w:tc>
-      </w:tr>
-      <w:tr>
-        <w:trPr>
-          <w:cantSplit/>
-        </w:trPr>
-        <w:tc>
-          <w:tcPr>
-            <w:tcW w:type="dxa" w:w="4326"/>
-            <w:tcBorders>
-              <w:top w:val="single" w:color="D9D9D9" w:sz="4"/>
-              <w:left w:val="single" w:color="D9D9D9" w:sz="4"/>
-              <w:bottom w:val="single" w:color="D9D9D9" w:sz="4"/>
-              <w:right w:val="single" w:color="D9D9D9" w:sz="4"/>
-            </w:tcBorders>
-            <w:tcMar>
-              <w:top w:type="dxa" w:w="80"/>
-              <w:left w:type="dxa" w:w="120"/>
-              <w:bottom w:type="dxa" w:w="80"/>
-              <w:right w:type="dxa" w:w="120"/>
-            </w:tcMar>
-          </w:tcPr>
-          <w:p>
-            <w:r>
-              <w:rPr>
-                <w:rFonts w:ascii="Arial" w:cs="Arial" w:eastAsia="Arial" w:hAnsi="Arial"/>
-                <w:b w:val="false"/>
-                <w:bCs w:val="false"/>
-                <w:sz w:val="20"/>
-                <w:szCs w:val="20"/>
-              </w:rPr>
-              <w:t xml:space="preserve">Point ksiracare.com at Netlify</w:t>
-            </w:r>
-          </w:p>
-        </w:tc>
-        <w:tc>
-          <w:tcPr>
-            <w:tcW w:type="dxa" w:w="1500"/>
-            <w:tcBorders>
-              <w:top w:val="single" w:color="D9D9D9" w:sz="4"/>
-              <w:left w:val="single" w:color="D9D9D9" w:sz="4"/>
-              <w:bottom w:val="single" w:color="D9D9D9" w:sz="4"/>
-              <w:right w:val="single" w:color="D9D9D9" w:sz="4"/>
-            </w:tcBorders>
-            <w:tcMar>
-              <w:top w:type="dxa" w:w="80"/>
-              <w:left w:type="dxa" w:w="120"/>
-              <w:bottom w:type="dxa" w:w="80"/>
-              <w:right w:type="dxa" w:w="120"/>
-            </w:tcMar>
-          </w:tcPr>
-          <w:p>
-            <w:r>
-              <w:rPr>
-                <w:rFonts w:ascii="Arial" w:cs="Arial" w:eastAsia="Arial" w:hAnsi="Arial"/>
-                <w:b w:val="false"/>
-                <w:bCs w:val="false"/>
-                <w:sz w:val="20"/>
-                <w:szCs w:val="20"/>
-              </w:rPr>
-              <w:t xml:space="preserve">DevOps</w:t>
-            </w:r>
-          </w:p>
-        </w:tc>
-        <w:tc>
-          <w:tcPr>
-            <w:tcW w:type="dxa" w:w="3200"/>
-            <w:tcBorders>
-              <w:top w:val="single" w:color="D9D9D9" w:sz="4"/>
-              <w:left w:val="single" w:color="D9D9D9" w:sz="4"/>
-              <w:bottom w:val="single" w:color="D9D9D9" w:sz="4"/>
-              <w:right w:val="single" w:color="D9D9D9" w:sz="4"/>
-            </w:tcBorders>
-            <w:tcMar>
-              <w:top w:type="dxa" w:w="80"/>
-              <w:left w:type="dxa" w:w="120"/>
-              <w:bottom w:type="dxa" w:w="80"/>
-              <w:right w:type="dxa" w:w="120"/>
-            </w:tcMar>
-          </w:tcPr>
-          <w:p>
-            <w:r>
-              <w:rPr>
-                <w:rFonts w:ascii="Arial" w:cs="Arial" w:eastAsia="Arial" w:hAnsi="Arial"/>
-                <w:b w:val="false"/>
-                <w:bCs w:val="false"/>
-                <w:sz w:val="20"/>
-                <w:szCs w:val="20"/>
-              </w:rPr>
-              <w:t xml:space="preserve">Blocker for launch: sign-in only works when the site and server share the ksiracare.com address.</w:t>
-            </w:r>
-          </w:p>
-        </w:tc>
-      </w:tr>
-      <w:tr>
-        <w:trPr>
-          <w:cantSplit/>
-        </w:trPr>
-        <w:tc>
-          <w:tcPr>
-            <w:tcW w:type="dxa" w:w="4326"/>
-            <w:tcBorders>
-              <w:top w:val="single" w:color="D9D9D9" w:sz="4"/>
-              <w:left w:val="single" w:color="D9D9D9" w:sz="4"/>
-              <w:bottom w:val="single" w:color="D9D9D9" w:sz="4"/>
-              <w:right w:val="single" w:color="D9D9D9" w:sz="4"/>
-            </w:tcBorders>
-            <w:tcMar>
-              <w:top w:type="dxa" w:w="80"/>
-              <w:left w:type="dxa" w:w="120"/>
-              <w:bottom w:type="dxa" w:w="80"/>
-              <w:right w:type="dxa" w:w="120"/>
-            </w:tcMar>
-          </w:tcPr>
-          <w:p>
-            <w:r>
-              <w:rPr>
-                <w:rFonts w:ascii="Arial" w:cs="Arial" w:eastAsia="Arial" w:hAnsi="Arial"/>
-                <w:b w:val="false"/>
-                <w:bCs w:val="false"/>
-                <w:sz w:val="20"/>
-                <w:szCs w:val="20"/>
-              </w:rPr>
-              <w:t xml:space="preserve">Add the first real therapists</w:t>
-            </w:r>
-          </w:p>
-        </w:tc>
-        <w:tc>
-          <w:tcPr>
-            <w:tcW w:type="dxa" w:w="1500"/>
-            <w:tcBorders>
-              <w:top w:val="single" w:color="D9D9D9" w:sz="4"/>
-              <w:left w:val="single" w:color="D9D9D9" w:sz="4"/>
-              <w:bottom w:val="single" w:color="D9D9D9" w:sz="4"/>
-              <w:right w:val="single" w:color="D9D9D9" w:sz="4"/>
-            </w:tcBorders>
-            <w:tcMar>
-              <w:top w:type="dxa" w:w="80"/>
-              <w:left w:type="dxa" w:w="120"/>
-              <w:bottom w:type="dxa" w:w="80"/>
-              <w:right w:type="dxa" w:w="120"/>
-            </w:tcMar>
-          </w:tcPr>
-          <w:p>
-            <w:r>
-              <w:rPr>
-                <w:rFonts w:ascii="Arial" w:cs="Arial" w:eastAsia="Arial" w:hAnsi="Arial"/>
-                <w:b w:val="false"/>
-                <w:bCs w:val="false"/>
-                <w:sz w:val="20"/>
-                <w:szCs w:val="20"/>
-              </w:rPr>
-              <w:t xml:space="preserve">Ops</w:t>
-            </w:r>
-          </w:p>
-        </w:tc>
-        <w:tc>
-          <w:tcPr>
-            <w:tcW w:type="dxa" w:w="3200"/>
-            <w:tcBorders>
-              <w:top w:val="single" w:color="D9D9D9" w:sz="4"/>
-              <w:left w:val="single" w:color="D9D9D9" w:sz="4"/>
-              <w:bottom w:val="single" w:color="D9D9D9" w:sz="4"/>
-              <w:right w:val="single" w:color="D9D9D9" w:sz="4"/>
-            </w:tcBorders>
-            <w:tcMar>
-              <w:top w:type="dxa" w:w="80"/>
-              <w:left w:type="dxa" w:w="120"/>
-              <w:bottom w:type="dxa" w:w="80"/>
-              <w:right w:type="dxa" w:w="120"/>
-            </w:tcMar>
-          </w:tcPr>
-          <w:p>
-            <w:r>
-              <w:rPr>
-                <w:rFonts w:ascii="Arial" w:cs="Arial" w:eastAsia="Arial" w:hAnsi="Arial"/>
-                <w:b w:val="false"/>
-                <w:bCs w:val="false"/>
-                <w:sz w:val="20"/>
-                <w:szCs w:val="20"/>
-              </w:rPr>
-              <w:t xml:space="preserve">The live database starts empty. Admins add therapists with a ready-made database command that stores passwords safely (hashed); a friendlier admin tool can come later.</w:t>
+              <w:t xml:space="preserve">Blocker for therapists signing in: the live database starts empty. Admins add therapists with a ready-made database command that stores passwords safely (hashed); a friendlier admin tool can come later.</w:t>
             </w:r>
           </w:p>
         </w:tc>
@@ -9615,6 +9431,69 @@
                 <w:szCs w:val="20"/>
               </w:rPr>
               <w:t xml:space="preserve">F6 Hosting: Netlify (website) + Render (server) + Neon (database), free tiers, Singapore. Vercel dropped — its free plan bars commercial use. Health check added for the host; instructions for adding therapists written. Remaining: create the accounts and point the domain.</w:t>
+            </w:r>
+          </w:p>
+        </w:tc>
+      </w:tr>
+      <w:tr>
+        <w:trPr>
+          <w:cantSplit/>
+        </w:trPr>
+        <w:tc>
+          <w:tcPr>
+            <w:tcW w:type="dxa" w:w="2000"/>
+            <w:tcBorders>
+              <w:top w:val="single" w:color="D9D9D9" w:sz="4"/>
+              <w:left w:val="single" w:color="D9D9D9" w:sz="4"/>
+              <w:bottom w:val="single" w:color="D9D9D9" w:sz="4"/>
+              <w:right w:val="single" w:color="D9D9D9" w:sz="4"/>
+            </w:tcBorders>
+            <w:tcMar>
+              <w:top w:type="dxa" w:w="80"/>
+              <w:left w:type="dxa" w:w="120"/>
+              <w:bottom w:type="dxa" w:w="80"/>
+              <w:right w:type="dxa" w:w="120"/>
+            </w:tcMar>
+          </w:tcPr>
+          <w:p>
+            <w:r>
+              <w:rPr>
+                <w:rFonts w:ascii="Arial" w:cs="Arial" w:eastAsia="Arial" w:hAnsi="Arial"/>
+                <w:b w:val="false"/>
+                <w:bCs w:val="false"/>
+                <w:sz w:val="20"/>
+                <w:szCs w:val="20"/>
+              </w:rPr>
+              <w:t xml:space="preserve">3 October 2026</w:t>
+            </w:r>
+          </w:p>
+        </w:tc>
+        <w:tc>
+          <w:tcPr>
+            <w:tcW w:type="dxa" w:w="7026"/>
+            <w:tcBorders>
+              <w:top w:val="single" w:color="D9D9D9" w:sz="4"/>
+              <w:left w:val="single" w:color="D9D9D9" w:sz="4"/>
+              <w:bottom w:val="single" w:color="D9D9D9" w:sz="4"/>
+              <w:right w:val="single" w:color="D9D9D9" w:sz="4"/>
+            </w:tcBorders>
+            <w:tcMar>
+              <w:top w:type="dxa" w:w="80"/>
+              <w:left w:type="dxa" w:w="120"/>
+              <w:bottom w:type="dxa" w:w="80"/>
+              <w:right w:type="dxa" w:w="120"/>
+            </w:tcMar>
+          </w:tcPr>
+          <w:p>
+            <w:r>
+              <w:rPr>
+                <w:rFonts w:ascii="Arial" w:cs="Arial" w:eastAsia="Arial" w:hAnsi="Arial"/>
+                <w:b w:val="false"/>
+                <w:bCs w:val="false"/>
+                <w:sz w:val="20"/>
+                <w:szCs w:val="20"/>
+              </w:rPr>
+              <w:t xml:space="preserve">F6 Live: ksiracare.com now runs on Render (website and server) with Neon (database), HTTPS on. Website moved from Netlify to Render after Netlify suspended the new account. Remaining: add the first therapists.</w:t>
             </w:r>
           </w:p>
         </w:tc>

</xml_diff>